<commit_message>
feat(cv): describe FSBR work with SIMAP, RH-SSO and PJe integration
The FSBR entry only listed the stack, which made it read like any other
full-stack job. Replace it with the actual work, kept at domain level so
no client or court is identified:

- legacy Java/JSF maintenance and stability
- SIMAP distribution engine with heuristic rules and priority weighting
  by court and by process category
- user authentication migration to RH-SSO (Keycloak)
- SIMAP/PJe database sync with Spring Batch and PostgreSQL scripts
- tighten CV spacing and margins so the extra bullets still fit one page
</commit_message>
<xml_diff>
--- a/assets/Curriculo-Carlos-Lima.docx
+++ b/assets/Curriculo-Carlos-Lima.docx
@@ -95,7 +95,7 @@
     </w:p>
     <w:p>
       <w:pPr>
-        <w:spacing w:before="120" w:after="80"/>
+        <w:spacing w:before="100" w:after="80"/>
         <w:pBdr>
           <w:bottom w:val="single" w:sz="6" w:space="2" w:color="C9CDD4"/>
         </w:pBdr>
@@ -135,7 +135,7 @@
     </w:p>
     <w:p>
       <w:pPr>
-        <w:spacing w:before="120" w:after="80"/>
+        <w:spacing w:before="100" w:after="80"/>
         <w:pBdr>
           <w:bottom w:val="single" w:sz="6" w:space="2" w:color="C9CDD4"/>
         </w:pBdr>
@@ -185,7 +185,7 @@
         <w:rPr>
           <w:sz w:val="21"/>
         </w:rPr>
-        <w:t>Desenvolvimento full-stack com Java/Spring e Angular, com JHipster na geração e evolução dos projetos.</w:t>
+        <w:t>Manutenção e evolução de sistemas legados em Java/JSF, com foco em estabilidade e continuidade operacional.</w:t>
       </w:r>
     </w:p>
     <w:p>
@@ -198,7 +198,7 @@
         <w:rPr>
           <w:sz w:val="21"/>
         </w:rPr>
-        <w:t>Construção e manutenção de APIs REST.</w:t>
+        <w:t>Evolução do SIMAP (distribuição de processos judiciais): motor de distribuição com regras heurísticas e ponderação por vara e por categoria.</w:t>
       </w:r>
     </w:p>
     <w:p>
@@ -211,7 +211,33 @@
         <w:rPr>
           <w:sz w:val="21"/>
         </w:rPr>
-        <w:t>Uso diário de IDE agêntica (Kiro) e do DeepSeek Harness no fluxo de análise, implementação e revisão de código.</w:t>
+        <w:t>Migração da autenticação de usuários para RH-SSO (Keycloak).</w:t>
+      </w:r>
+    </w:p>
+    <w:p>
+      <w:pPr>
+        <w:spacing w:after="20"/>
+        <w:ind w:left="510"/>
+        <w:jc w:val="both"/>
+      </w:pPr>
+      <w:r>
+        <w:rPr>
+          <w:sz w:val="21"/>
+        </w:rPr>
+        <w:t>Integração entre as bases do SIMAP e do PJe para sincronização de processos, com Spring Batch e scripts SQL em PostgreSQL.</w:t>
+      </w:r>
+    </w:p>
+    <w:p>
+      <w:pPr>
+        <w:spacing w:after="20"/>
+        <w:ind w:left="510"/>
+        <w:jc w:val="both"/>
+      </w:pPr>
+      <w:r>
+        <w:rPr>
+          <w:sz w:val="21"/>
+        </w:rPr>
+        <w:t>Desenvolvimento full-stack com Java/Spring e Angular (JHipster); uso diário de Kiro e DeepSeek Harness.</w:t>
       </w:r>
     </w:p>
     <w:p>
@@ -450,7 +476,7 @@
     </w:p>
     <w:p>
       <w:pPr>
-        <w:spacing w:before="120" w:after="80"/>
+        <w:spacing w:before="100" w:after="80"/>
         <w:pBdr>
           <w:bottom w:val="single" w:sz="6" w:space="2" w:color="C9CDD4"/>
         </w:pBdr>
@@ -528,7 +554,7 @@
     </w:p>
     <w:p>
       <w:pPr>
-        <w:spacing w:before="120" w:after="80"/>
+        <w:spacing w:before="100" w:after="80"/>
         <w:pBdr>
           <w:bottom w:val="single" w:sz="6" w:space="2" w:color="C9CDD4"/>
         </w:pBdr>
@@ -658,7 +684,7 @@
     </w:p>
     <w:p>
       <w:pPr>
-        <w:spacing w:before="120" w:after="80"/>
+        <w:spacing w:before="100" w:after="80"/>
         <w:pBdr>
           <w:bottom w:val="single" w:sz="6" w:space="2" w:color="C9CDD4"/>
         </w:pBdr>
@@ -682,7 +708,7 @@
     </w:p>
     <w:sectPr>
       <w:pgSz w:w="11906" w:h="16838"/>
-      <w:pgMar w:top="794" w:right="964" w:bottom="794" w:left="964" w:header="720" w:footer="720" w:gutter="0"/>
+      <w:pgMar w:top="652" w:right="964" w:bottom="652" w:left="964" w:header="720" w:footer="720" w:gutter="0"/>
       <w:cols w:space="720"/>
       <w:docGrid w:linePitch="360"/>
     </w:sectPr>
@@ -1054,7 +1080,7 @@
     <w:qFormat/>
     <w:rsid w:val="00FC693F"/>
     <w:pPr>
-      <w:spacing w:after="50" w:line="252" w:lineRule="auto"/>
+      <w:spacing w:after="40" w:line="240" w:lineRule="auto"/>
     </w:pPr>
     <w:rPr>
       <w:rFonts w:ascii="Calibri" w:hAnsi="Calibri"/>

</xml_diff>

<commit_message>
fix(cv): describe SIMAP as new development on Java 21
SIMAP and Atrium were born on Java 21, so framing the work as
modernization was wrong, and the Java/JSF maintenance was not a migration
path either. Rewrite the FSBR entry to:

- present SIMAP as a new application on Java 21, Spring Boot 3, Angular 18
  and JHipster
- separate the PJe integration and the RH-SSO migration from the legacy
  JSF maintenance
</commit_message>
<xml_diff>
--- a/assets/Curriculo-Carlos-Lima.docx
+++ b/assets/Curriculo-Carlos-Lima.docx
@@ -185,7 +185,7 @@
         <w:rPr>
           <w:sz w:val="21"/>
         </w:rPr>
-        <w:t>Manutenção e evolução de sistemas legados em Java/JSF, com foco em estabilidade e continuidade operacional.</w:t>
+        <w:t>Desenvolvimento do SIMAP (acompanhamento e distribuição de processos judiciais): aplicação nova em Java 21, Spring Boot 3 e Angular 18 sobre JHipster, com regras heurísticas de priorização por vara e por categoria.</w:t>
       </w:r>
     </w:p>
     <w:p>
@@ -198,7 +198,7 @@
         <w:rPr>
           <w:sz w:val="21"/>
         </w:rPr>
-        <w:t>Evolução do SIMAP (distribuição de processos judiciais): motor de distribuição com regras heurísticas e ponderação por vara e por categoria.</w:t>
+        <w:t>Integração entre as bases do SIMAP e do PJe para sincronização de processos, com Spring Batch e scripts SQL em PostgreSQL.</w:t>
       </w:r>
     </w:p>
     <w:p>
@@ -224,7 +224,7 @@
         <w:rPr>
           <w:sz w:val="21"/>
         </w:rPr>
-        <w:t>Integração entre as bases do SIMAP e do PJe para sincronização de processos, com Spring Batch e scripts SQL em PostgreSQL.</w:t>
+        <w:t>Manutenção de sistemas legados em Java/JSF em operação.</w:t>
       </w:r>
     </w:p>
     <w:p>
@@ -237,7 +237,7 @@
         <w:rPr>
           <w:sz w:val="21"/>
         </w:rPr>
-        <w:t>Desenvolvimento full-stack com Java/Spring e Angular (JHipster); uso diário de Kiro e DeepSeek Harness.</w:t>
+        <w:t>Uso diário de IDE agêntica (Kiro) e DeepSeek Harness no fluxo de desenvolvimento.</w:t>
       </w:r>
     </w:p>
     <w:p>

</xml_diff>